<commit_message>
docs: prototype + blueprint refresh
- Add 7 new prototype pages: admin/audit-log, admin/property-detail,
  admin/units, pm/lease-detail, pm/tenant-detail, pm/units,
  reset-password
- Update 20 existing prototype pages across admin / pm / tenant /
  maintenance for the latest UI iteration
- Bump Blueprint_Property_Rental_Application_v8.docx with the
  corresponding spec updates

Co-Authored-By: Claude Opus 4.7 (1M context) <noreply@anthropic.com>
</commit_message>
<xml_diff>
--- a/document/Blueprint_Property_Rental_Application_v8.docx
+++ b/document/Blueprint_Property_Rental_Application_v8.docx
@@ -2006,6 +2006,1041 @@
           <w:szCs w:val="24"/>
         </w:rPr>
         <w:t>Let's build something that actually fits your business.</w:t>
+      </w:r>
+    </w:p>
+    <w:p>
+      <w:pPr>
+        <w:pStyle w:val="Normal"/>
+        <w:rPr/>
+      </w:pPr>
+      <w:r>
+        <w:rPr/>
+      </w:r>
+      <w:r>
+        <w:br w:type="page"/>
+      </w:r>
+    </w:p>
+    <w:p>
+      <w:pPr>
+        <w:pStyle w:val="Heading1"/>
+        <w:spacing w:before="0" w:after="120"/>
+        <w:rPr/>
+      </w:pPr>
+      <w:r>
+        <w:rPr/>
+        <w:t xml:space="preserve">Version 2 — Changes and Confirmed Decisions</w:t>
+      </w:r>
+    </w:p>
+    <w:p>
+      <w:pPr>
+        <w:pStyle w:val="Normal"/>
+        <w:spacing w:before="0" w:after="120"/>
+        <w:rPr/>
+      </w:pPr>
+      <w:r>
+        <w:rPr>
+          <w:i/>
+          <w:iCs/>
+        </w:rPr>
+        <w:t xml:space="preserve">Document update date: May 2026</w:t>
+      </w:r>
+    </w:p>
+    <w:p>
+      <w:pPr>
+        <w:pStyle w:val="Normal"/>
+        <w:spacing w:before="0" w:after="120"/>
+        <w:rPr/>
+      </w:pPr>
+      <w:r>
+        <w:t xml:space="preserve">This section captures every decision confirmed and feature delivered during the build of Version 1, plus the new capabilities now in scope. The original content above is unchanged — anything in this section either supersedes earlier text or adds to it.</w:t>
+      </w:r>
+    </w:p>
+    <w:p>
+      <w:pPr>
+        <w:pStyle w:val="Heading2"/>
+        <w:spacing w:before="200" w:after="100"/>
+        <w:rPr/>
+      </w:pPr>
+      <w:r>
+        <w:rPr/>
+        <w:t xml:space="preserve">1. Rent Change Scheduling</w:t>
+      </w:r>
+    </w:p>
+    <w:p>
+      <w:pPr>
+        <w:pStyle w:val="Normal"/>
+        <w:spacing w:before="0" w:after="120"/>
+        <w:rPr/>
+      </w:pPr>
+      <w:r>
+        <w:t xml:space="preserve">The original blueprint stated that rent is locked for the duration of the lease and cannot be changed mid-term. That rule still holds for any change taking effect immediately. We have now added a controlled way to schedule a future rent change so tenants always get fair notice.</w:t>
+      </w:r>
+    </w:p>
+    <w:p>
+      <w:pPr>
+        <w:pStyle w:val="Heading3"/>
+        <w:spacing w:before="160" w:after="80"/>
+        <w:rPr/>
+      </w:pPr>
+      <w:r>
+        <w:rPr/>
+        <w:t xml:space="preserve">How It Works</w:t>
+      </w:r>
+    </w:p>
+    <w:p>
+      <w:pPr>
+        <w:pStyle w:val="ListParagraph"/>
+        <w:numPr>
+          <w:ilvl w:val="0"/>
+          <w:numId w:val="1"/>
+        </w:numPr>
+        <w:spacing w:before="0" w:after="60"/>
+        <w:rPr/>
+      </w:pPr>
+      <w:r>
+        <w:rPr>
+          <w:b/>
+          <w:bCs/>
+        </w:rPr>
+        <w:t xml:space="preserve">Minimum 60-day notice. </w:t>
+      </w:r>
+      <w:r>
+        <w:rPr/>
+        <w:t xml:space="preserve">A 60-day minimum notice is required between the day a change is scheduled and the day it takes effect.</w:t>
+      </w:r>
+    </w:p>
+    <w:p>
+      <w:pPr>
+        <w:pStyle w:val="ListParagraph"/>
+        <w:numPr>
+          <w:ilvl w:val="0"/>
+          <w:numId w:val="1"/>
+        </w:numPr>
+        <w:spacing w:before="0" w:after="60"/>
+        <w:rPr/>
+      </w:pPr>
+      <w:r>
+        <w:rPr>
+          <w:b/>
+          <w:bCs/>
+        </w:rPr>
+        <w:t xml:space="preserve">Who can schedule. </w:t>
+      </w:r>
+      <w:r>
+        <w:rPr/>
+        <w:t xml:space="preserve">The Property Manager enters the new rent amount and the effective date on the lease detail screen.</w:t>
+      </w:r>
+    </w:p>
+    <w:p>
+      <w:pPr>
+        <w:pStyle w:val="ListParagraph"/>
+        <w:numPr>
+          <w:ilvl w:val="0"/>
+          <w:numId w:val="1"/>
+        </w:numPr>
+        <w:spacing w:before="0" w:after="60"/>
+        <w:rPr/>
+      </w:pPr>
+      <w:r>
+        <w:rPr>
+          <w:b/>
+          <w:bCs/>
+        </w:rPr>
+        <w:t xml:space="preserve">Hard validation. </w:t>
+      </w:r>
+      <w:r>
+        <w:rPr/>
+        <w:t xml:space="preserve">The system rejects the schedule if the effective date is less than 60 days from today. No exceptions.</w:t>
+      </w:r>
+    </w:p>
+    <w:p>
+      <w:pPr>
+        <w:pStyle w:val="ListParagraph"/>
+        <w:numPr>
+          <w:ilvl w:val="0"/>
+          <w:numId w:val="1"/>
+        </w:numPr>
+        <w:spacing w:before="0" w:after="60"/>
+        <w:rPr/>
+      </w:pPr>
+      <w:r>
+        <w:rPr>
+          <w:b/>
+          <w:bCs/>
+        </w:rPr>
+        <w:t xml:space="preserve">Tenant notifications. </w:t>
+      </w:r>
+      <w:r>
+        <w:rPr/>
+        <w:t xml:space="preserve">The tenant receives an email when the change is scheduled, modified, or cancelled. Every change is communicated.</w:t>
+      </w:r>
+    </w:p>
+    <w:p>
+      <w:pPr>
+        <w:pStyle w:val="ListParagraph"/>
+        <w:numPr>
+          <w:ilvl w:val="0"/>
+          <w:numId w:val="1"/>
+        </w:numPr>
+        <w:spacing w:before="0" w:after="60"/>
+        <w:rPr/>
+      </w:pPr>
+      <w:r>
+        <w:rPr>
+          <w:b/>
+          <w:bCs/>
+        </w:rPr>
+        <w:t xml:space="preserve">Listing transparency. </w:t>
+      </w:r>
+      <w:r>
+        <w:rPr/>
+        <w:t xml:space="preserve">If the unit is also listed for new tenants, the listing immediately shows the new rent with an "effective from [date]" note so prospective tenants are not misled.</w:t>
+      </w:r>
+    </w:p>
+    <w:p>
+      <w:pPr>
+        <w:pStyle w:val="ListParagraph"/>
+        <w:numPr>
+          <w:ilvl w:val="0"/>
+          <w:numId w:val="1"/>
+        </w:numPr>
+        <w:spacing w:before="0" w:after="60"/>
+        <w:rPr/>
+      </w:pPr>
+      <w:r>
+        <w:rPr>
+          <w:b/>
+          <w:bCs/>
+        </w:rPr>
+        <w:t xml:space="preserve">Automatic application. </w:t>
+      </w:r>
+      <w:r>
+        <w:rPr/>
+        <w:t xml:space="preserve">A background job runs every night and automatically applies any change whose effective date has arrived. The Property Manager does not need to do anything on the day.</w:t>
+      </w:r>
+    </w:p>
+    <w:p>
+      <w:pPr>
+        <w:pStyle w:val="ListParagraph"/>
+        <w:numPr>
+          <w:ilvl w:val="0"/>
+          <w:numId w:val="1"/>
+        </w:numPr>
+        <w:spacing w:before="0" w:after="60"/>
+        <w:rPr/>
+      </w:pPr>
+      <w:r>
+        <w:rPr>
+          <w:b/>
+          <w:bCs/>
+        </w:rPr>
+        <w:t xml:space="preserve">Tenant visibility. </w:t>
+      </w:r>
+      <w:r>
+        <w:rPr/>
+        <w:t xml:space="preserve">The tenant dashboard shows an amber banner with the upcoming change — new amount, effective date, days remaining — so the tenant cannot miss it.</w:t>
+      </w:r>
+    </w:p>
+    <w:tbl>
+      <w:tblPr>
+        <w:tblW w:w="9360" w:type="dxa"/>
+        <w:jc w:val="left"/>
+        <w:tblInd w:w="0" w:type="dxa"/>
+        <w:tblLayout w:type="fixed"/>
+        <w:tblCellMar>
+          <w:top w:w="160" w:type="dxa"/>
+          <w:left w:w="200" w:type="dxa"/>
+          <w:bottom w:w="160" w:type="dxa"/>
+          <w:right w:w="200" w:type="dxa"/>
+        </w:tblCellMar>
+      </w:tblPr>
+      <w:tblGrid>
+        <w:gridCol w:w="9360"/>
+      </w:tblGrid>
+      <w:tr>
+        <w:trPr/>
+        <w:tc>
+          <w:tcPr>
+            <w:tcW w:w="9360" w:type="dxa"/>
+            <w:tcBorders>
+              <w:top w:val="single" w:sz="8" w:space="0" w:color="2E75B6"/>
+              <w:left w:val="single" w:sz="24" w:space="0" w:color="2E75B6"/>
+              <w:bottom w:val="single" w:sz="8" w:space="0" w:color="2E75B6"/>
+              <w:right w:val="single" w:sz="8" w:space="0" w:color="2E75B6"/>
+            </w:tcBorders>
+            <w:shd w:fill="DEEAF6" w:val="clear"/>
+          </w:tcPr>
+          <w:p>
+            <w:pPr>
+              <w:pStyle w:val="Normal"/>
+              <w:rPr/>
+            </w:pPr>
+            <w:r>
+              <w:rPr>
+                <w:i/>
+                <w:iCs/>
+              </w:rPr>
+              <w:t xml:space="preserve">Why this is safe: the 60-day rule, the cron-driven application, and the always-visible banner together make sudden rent hikes impossible. Both sides see the same information at the same time.</w:t>
+            </w:r>
+          </w:p>
+        </w:tc>
+      </w:tr>
+    </w:tbl>
+    <w:p>
+      <w:pPr>
+        <w:pStyle w:val="Heading2"/>
+        <w:spacing w:before="200" w:after="100"/>
+        <w:rPr/>
+      </w:pPr>
+      <w:r>
+        <w:rPr/>
+        <w:t xml:space="preserve">2. User Management</w:t>
+      </w:r>
+    </w:p>
+    <w:p>
+      <w:pPr>
+        <w:pStyle w:val="Normal"/>
+        <w:spacing w:before="0" w:after="120"/>
+        <w:rPr/>
+      </w:pPr>
+      <w:r>
+        <w:t xml:space="preserve">The original blueprint said Admins and Property Managers create accounts. We have now confirmed exactly how that works in the system.</w:t>
+      </w:r>
+    </w:p>
+    <w:p>
+      <w:pPr>
+        <w:pStyle w:val="Heading3"/>
+        <w:spacing w:before="160" w:after="80"/>
+        <w:rPr/>
+      </w:pPr>
+      <w:r>
+        <w:rPr/>
+        <w:t xml:space="preserve">Confirmed Decisions</w:t>
+      </w:r>
+    </w:p>
+    <w:p>
+      <w:pPr>
+        <w:pStyle w:val="ListParagraph"/>
+        <w:numPr>
+          <w:ilvl w:val="0"/>
+          <w:numId w:val="1"/>
+        </w:numPr>
+        <w:spacing w:before="0" w:after="60"/>
+        <w:rPr/>
+      </w:pPr>
+      <w:r>
+        <w:rPr>
+          <w:b/>
+          <w:bCs/>
+        </w:rPr>
+        <w:t xml:space="preserve">Password at creation. </w:t>
+      </w:r>
+      <w:r>
+        <w:rPr/>
+        <w:t xml:space="preserve">When creating any user (Admin, Property Manager, Maintenance, Tenant), the creator enters email, phone, and a password at creation time. The user can sign in immediately with those credentials.</w:t>
+      </w:r>
+    </w:p>
+    <w:p>
+      <w:pPr>
+        <w:pStyle w:val="ListParagraph"/>
+        <w:numPr>
+          <w:ilvl w:val="0"/>
+          <w:numId w:val="1"/>
+        </w:numPr>
+        <w:spacing w:before="0" w:after="60"/>
+        <w:rPr/>
+      </w:pPr>
+      <w:r>
+        <w:rPr>
+          <w:b/>
+          <w:bCs/>
+        </w:rPr>
+        <w:t xml:space="preserve">Maintenance specialization. </w:t>
+      </w:r>
+      <w:r>
+        <w:rPr/>
+        <w:t xml:space="preserve">Maintenance users have a specialization field — Plumber, Electrician, Carpenter, HVAC, Cleaner, or General — used for routing and reporting.</w:t>
+      </w:r>
+    </w:p>
+    <w:p>
+      <w:pPr>
+        <w:pStyle w:val="ListParagraph"/>
+        <w:numPr>
+          <w:ilvl w:val="0"/>
+          <w:numId w:val="1"/>
+        </w:numPr>
+        <w:spacing w:before="0" w:after="60"/>
+        <w:rPr/>
+      </w:pPr>
+      <w:r>
+        <w:rPr>
+          <w:b/>
+          <w:bCs/>
+        </w:rPr>
+        <w:t xml:space="preserve">Admin password reset. </w:t>
+      </w:r>
+      <w:r>
+        <w:rPr/>
+        <w:t xml:space="preserve">Admin can reset any user's password from the Edit User screen. The new password takes effect immediately; the previous password stops working.</w:t>
+      </w:r>
+    </w:p>
+    <w:p>
+      <w:pPr>
+        <w:pStyle w:val="ListParagraph"/>
+        <w:numPr>
+          <w:ilvl w:val="0"/>
+          <w:numId w:val="1"/>
+        </w:numPr>
+        <w:spacing w:before="0" w:after="60"/>
+        <w:rPr/>
+      </w:pPr>
+      <w:r>
+        <w:rPr>
+          <w:b/>
+          <w:bCs/>
+        </w:rPr>
+        <w:t xml:space="preserve">Tenant onboarding. </w:t>
+      </w:r>
+      <w:r>
+        <w:rPr/>
+        <w:t xml:space="preserve">Tenant passwords are set by the Property Manager at lease signing, so the tenant can sign in the moment the lease starts.</w:t>
+      </w:r>
+    </w:p>
+    <w:p>
+      <w:pPr>
+        <w:pStyle w:val="ListParagraph"/>
+        <w:numPr>
+          <w:ilvl w:val="0"/>
+          <w:numId w:val="1"/>
+        </w:numPr>
+        <w:spacing w:before="0" w:after="60"/>
+        <w:rPr/>
+      </w:pPr>
+      <w:r>
+        <w:rPr>
+          <w:b/>
+          <w:bCs/>
+        </w:rPr>
+        <w:t xml:space="preserve">Admin notification on self-change. </w:t>
+      </w:r>
+      <w:r>
+        <w:rPr/>
+        <w:t xml:space="preserve">Whenever any user changes their own password, an email notification is sent to all Admins. This catches account hijacking attempts early.</w:t>
+      </w:r>
+    </w:p>
+    <w:p>
+      <w:pPr>
+        <w:pStyle w:val="ListParagraph"/>
+        <w:numPr>
+          <w:ilvl w:val="0"/>
+          <w:numId w:val="1"/>
+        </w:numPr>
+        <w:spacing w:before="0" w:after="60"/>
+        <w:rPr/>
+      </w:pPr>
+      <w:r>
+        <w:rPr>
+          <w:b/>
+          <w:bCs/>
+        </w:rPr>
+        <w:t xml:space="preserve">No plain-text passwords. </w:t>
+      </w:r>
+      <w:r>
+        <w:rPr/>
+        <w:t xml:space="preserve">Passwords are hashed using bcrypt. The plain-text password is never stored, never shown in any screen, and never written to any log.</w:t>
+      </w:r>
+    </w:p>
+    <w:p>
+      <w:pPr>
+        <w:pStyle w:val="Heading2"/>
+        <w:spacing w:before="200" w:after="100"/>
+        <w:rPr/>
+      </w:pPr>
+      <w:r>
+        <w:rPr/>
+        <w:t xml:space="preserve">3. Forgot Password (Self-Service)</w:t>
+      </w:r>
+    </w:p>
+    <w:p>
+      <w:pPr>
+        <w:pStyle w:val="Normal"/>
+        <w:spacing w:before="0" w:after="120"/>
+        <w:rPr/>
+      </w:pPr>
+      <w:r>
+        <w:t xml:space="preserve">The original blueprint did not specify a way for users to recover access if they forgot their password. We have now added a self-service flow so users do not have to call the Property Manager or Admin.</w:t>
+      </w:r>
+    </w:p>
+    <w:p>
+      <w:pPr>
+        <w:pStyle w:val="Heading3"/>
+        <w:spacing w:before="160" w:after="80"/>
+        <w:rPr/>
+      </w:pPr>
+      <w:r>
+        <w:rPr/>
+        <w:t xml:space="preserve">How It Works</w:t>
+      </w:r>
+    </w:p>
+    <w:p>
+      <w:pPr>
+        <w:pStyle w:val="ListParagraph"/>
+        <w:numPr>
+          <w:ilvl w:val="0"/>
+          <w:numId w:val="1"/>
+        </w:numPr>
+        <w:spacing w:before="0" w:after="60"/>
+        <w:rPr/>
+      </w:pPr>
+      <w:r>
+        <w:rPr>
+          <w:b/>
+          <w:bCs/>
+        </w:rPr>
+        <w:t xml:space="preserve">Step 1. </w:t>
+      </w:r>
+      <w:r>
+        <w:rPr/>
+        <w:t xml:space="preserve">On the login screen, the user clicks "Forgot password" and enters their email.</w:t>
+      </w:r>
+    </w:p>
+    <w:p>
+      <w:pPr>
+        <w:pStyle w:val="ListParagraph"/>
+        <w:numPr>
+          <w:ilvl w:val="0"/>
+          <w:numId w:val="1"/>
+        </w:numPr>
+        <w:spacing w:before="0" w:after="60"/>
+        <w:rPr/>
+      </w:pPr>
+      <w:r>
+        <w:rPr>
+          <w:b/>
+          <w:bCs/>
+        </w:rPr>
+        <w:t xml:space="preserve">Step 2. </w:t>
+      </w:r>
+      <w:r>
+        <w:rPr/>
+        <w:t xml:space="preserve">The system sends a reset link to that email via SMTP (Nodemailer).</w:t>
+      </w:r>
+    </w:p>
+    <w:p>
+      <w:pPr>
+        <w:pStyle w:val="ListParagraph"/>
+        <w:numPr>
+          <w:ilvl w:val="0"/>
+          <w:numId w:val="1"/>
+        </w:numPr>
+        <w:spacing w:before="0" w:after="60"/>
+        <w:rPr/>
+      </w:pPr>
+      <w:r>
+        <w:rPr>
+          <w:b/>
+          <w:bCs/>
+        </w:rPr>
+        <w:t xml:space="preserve">Step 3. </w:t>
+      </w:r>
+      <w:r>
+        <w:rPr/>
+        <w:t xml:space="preserve">The link contains a single-use token that is valid for 30 minutes. After 30 minutes or one use, the token is dead.</w:t>
+      </w:r>
+    </w:p>
+    <w:p>
+      <w:pPr>
+        <w:pStyle w:val="ListParagraph"/>
+        <w:numPr>
+          <w:ilvl w:val="0"/>
+          <w:numId w:val="1"/>
+        </w:numPr>
+        <w:spacing w:before="0" w:after="60"/>
+        <w:rPr/>
+      </w:pPr>
+      <w:r>
+        <w:rPr>
+          <w:b/>
+          <w:bCs/>
+        </w:rPr>
+        <w:t xml:space="preserve">Step 4. </w:t>
+      </w:r>
+      <w:r>
+        <w:rPr/>
+        <w:t xml:space="preserve">The user opens the link, enters a new password twice, and signs in.</w:t>
+      </w:r>
+    </w:p>
+    <w:p>
+      <w:pPr>
+        <w:pStyle w:val="Heading2"/>
+        <w:spacing w:before="200" w:after="100"/>
+        <w:rPr/>
+      </w:pPr>
+      <w:r>
+        <w:rPr/>
+        <w:t xml:space="preserve">4. Access Control — Additions</w:t>
+      </w:r>
+    </w:p>
+    <w:p>
+      <w:pPr>
+        <w:pStyle w:val="Normal"/>
+        <w:spacing w:before="0" w:after="120"/>
+        <w:rPr/>
+      </w:pPr>
+      <w:r>
+        <w:t xml:space="preserve">Two extra privacy rules were confirmed during the build:</w:t>
+      </w:r>
+    </w:p>
+    <w:p>
+      <w:pPr>
+        <w:pStyle w:val="ListParagraph"/>
+        <w:numPr>
+          <w:ilvl w:val="0"/>
+          <w:numId w:val="1"/>
+        </w:numPr>
+        <w:spacing w:before="0" w:after="60"/>
+        <w:rPr/>
+      </w:pPr>
+      <w:r>
+        <w:rPr>
+          <w:b/>
+          <w:bCs/>
+        </w:rPr>
+        <w:t xml:space="preserve">Bank ref hidden from Tenant. </w:t>
+      </w:r>
+      <w:r>
+        <w:rPr/>
+        <w:t xml:space="preserve">Tenants never see the bank reference number on their lease detail page. The reference is internal — visible to Property Managers and Admins only.</w:t>
+      </w:r>
+    </w:p>
+    <w:p>
+      <w:pPr>
+        <w:pStyle w:val="ListParagraph"/>
+        <w:numPr>
+          <w:ilvl w:val="0"/>
+          <w:numId w:val="1"/>
+        </w:numPr>
+        <w:spacing w:before="0" w:after="60"/>
+        <w:rPr/>
+      </w:pPr>
+      <w:r>
+        <w:rPr>
+          <w:b/>
+          <w:bCs/>
+        </w:rPr>
+        <w:t xml:space="preserve">PII in PM search. </w:t>
+      </w:r>
+      <w:r>
+        <w:rPr/>
+        <w:t xml:space="preserve">When a Property Manager searches for a tenant, the result list does not show the tenant's phone or email. The PM only sees these after opening the tenant's detail page (where access is audited).</w:t>
+      </w:r>
+    </w:p>
+    <w:p>
+      <w:pPr>
+        <w:pStyle w:val="Heading2"/>
+        <w:spacing w:before="200" w:after="100"/>
+        <w:rPr/>
+      </w:pPr>
+      <w:r>
+        <w:rPr/>
+        <w:t xml:space="preserve">5. Audit Log — Events Added</w:t>
+      </w:r>
+    </w:p>
+    <w:p>
+      <w:pPr>
+        <w:pStyle w:val="Normal"/>
+        <w:spacing w:before="0" w:after="120"/>
+        <w:rPr/>
+      </w:pPr>
+      <w:r>
+        <w:t xml:space="preserve">The audit log now records the following events, in addition to the events listed in the original blueprint:</w:t>
+      </w:r>
+    </w:p>
+    <w:p>
+      <w:pPr>
+        <w:pStyle w:val="ListParagraph"/>
+        <w:numPr>
+          <w:ilvl w:val="0"/>
+          <w:numId w:val="1"/>
+        </w:numPr>
+        <w:spacing w:before="0" w:after="60"/>
+        <w:rPr/>
+      </w:pPr>
+      <w:r>
+        <w:rPr>
+          <w:b/>
+          <w:bCs/>
+        </w:rPr>
+        <w:t xml:space="preserve">USER_LOGIN, USER_LOGOUT. </w:t>
+      </w:r>
+      <w:r>
+        <w:rPr/>
+        <w:t xml:space="preserve">Every sign-in and sign-out is recorded with timestamp and IP.</w:t>
+      </w:r>
+    </w:p>
+    <w:p>
+      <w:pPr>
+        <w:pStyle w:val="ListParagraph"/>
+        <w:numPr>
+          <w:ilvl w:val="0"/>
+          <w:numId w:val="1"/>
+        </w:numPr>
+        <w:spacing w:before="0" w:after="60"/>
+        <w:rPr/>
+      </w:pPr>
+      <w:r>
+        <w:rPr>
+          <w:b/>
+          <w:bCs/>
+        </w:rPr>
+        <w:t xml:space="preserve">LEASE_CREATED, LEASE_TERMINATED. </w:t>
+      </w:r>
+      <w:r>
+        <w:rPr/>
+        <w:t xml:space="preserve">Lease creation and termination are recorded with full context.</w:t>
+      </w:r>
+    </w:p>
+    <w:p>
+      <w:pPr>
+        <w:pStyle w:val="ListParagraph"/>
+        <w:numPr>
+          <w:ilvl w:val="0"/>
+          <w:numId w:val="1"/>
+        </w:numPr>
+        <w:spacing w:before="0" w:after="60"/>
+        <w:rPr/>
+      </w:pPr>
+      <w:r>
+        <w:rPr>
+          <w:b/>
+          <w:bCs/>
+        </w:rPr>
+        <w:t xml:space="preserve">DEPOSIT_REFUND_PROCESSED. </w:t>
+      </w:r>
+      <w:r>
+        <w:rPr/>
+        <w:t xml:space="preserve">Every deposit refund (partial or full) is recorded with amount and reason.</w:t>
+      </w:r>
+    </w:p>
+    <w:p>
+      <w:pPr>
+        <w:pStyle w:val="ListParagraph"/>
+        <w:numPr>
+          <w:ilvl w:val="0"/>
+          <w:numId w:val="1"/>
+        </w:numPr>
+        <w:spacing w:before="0" w:after="60"/>
+        <w:rPr/>
+      </w:pPr>
+      <w:r>
+        <w:rPr>
+          <w:b/>
+          <w:bCs/>
+        </w:rPr>
+        <w:t xml:space="preserve">RENT_CHANGE_SCHEDULED, RENT_CHANGE_APPLIED, RENT_CHANGE_CANCELLED. </w:t>
+      </w:r>
+      <w:r>
+        <w:rPr/>
+        <w:t xml:space="preserve">Rent change scheduling, application, and cancellation are each their own event.</w:t>
+      </w:r>
+    </w:p>
+    <w:p>
+      <w:pPr>
+        <w:pStyle w:val="ListParagraph"/>
+        <w:numPr>
+          <w:ilvl w:val="0"/>
+          <w:numId w:val="1"/>
+        </w:numPr>
+        <w:spacing w:before="0" w:after="60"/>
+        <w:rPr/>
+      </w:pPr>
+      <w:r>
+        <w:rPr>
+          <w:b/>
+          <w:bCs/>
+        </w:rPr>
+        <w:t xml:space="preserve">MAINTENANCE_STATUS_CHANGED. </w:t>
+      </w:r>
+      <w:r>
+        <w:rPr/>
+        <w:t xml:space="preserve">Any change to a maintenance request status is recorded (open → assigned → in-progress → resolved → closed).</w:t>
+      </w:r>
+    </w:p>
+    <w:p>
+      <w:pPr>
+        <w:pStyle w:val="ListParagraph"/>
+        <w:numPr>
+          <w:ilvl w:val="0"/>
+          <w:numId w:val="1"/>
+        </w:numPr>
+        <w:spacing w:before="0" w:after="60"/>
+        <w:rPr/>
+      </w:pPr>
+      <w:r>
+        <w:rPr>
+          <w:b/>
+          <w:bCs/>
+        </w:rPr>
+        <w:t xml:space="preserve">CO_TENANT_CONSENT_GIVEN, CO_TENANT_CONSENT_REJECTED. </w:t>
+      </w:r>
+      <w:r>
+        <w:rPr/>
+        <w:t xml:space="preserve">Co-tenant consent decisions on lease termination are recorded.</w:t>
+      </w:r>
+    </w:p>
+    <w:p>
+      <w:pPr>
+        <w:pStyle w:val="ListParagraph"/>
+        <w:numPr>
+          <w:ilvl w:val="0"/>
+          <w:numId w:val="1"/>
+        </w:numPr>
+        <w:spacing w:before="0" w:after="60"/>
+        <w:rPr/>
+      </w:pPr>
+      <w:r>
+        <w:rPr>
+          <w:b/>
+          <w:bCs/>
+        </w:rPr>
+        <w:t xml:space="preserve">PROPERTY_TRANSFERRED. </w:t>
+      </w:r>
+      <w:r>
+        <w:rPr/>
+        <w:t xml:space="preserve">When a property is reassigned to a different Property Manager.</w:t>
+      </w:r>
+    </w:p>
+    <w:p>
+      <w:pPr>
+        <w:pStyle w:val="ListParagraph"/>
+        <w:numPr>
+          <w:ilvl w:val="0"/>
+          <w:numId w:val="1"/>
+        </w:numPr>
+        <w:spacing w:before="0" w:after="60"/>
+        <w:rPr/>
+      </w:pPr>
+      <w:r>
+        <w:rPr>
+          <w:b/>
+          <w:bCs/>
+        </w:rPr>
+        <w:t xml:space="preserve">ADMIN_RESET_PASSWORD. </w:t>
+      </w:r>
+      <w:r>
+        <w:rPr/>
+        <w:t xml:space="preserve">Every password reset performed by an Admin.</w:t>
+      </w:r>
+    </w:p>
+    <w:tbl>
+      <w:tblPr>
+        <w:tblW w:w="9360" w:type="dxa"/>
+        <w:jc w:val="left"/>
+        <w:tblInd w:w="0" w:type="dxa"/>
+        <w:tblLayout w:type="fixed"/>
+        <w:tblCellMar>
+          <w:top w:w="160" w:type="dxa"/>
+          <w:left w:w="200" w:type="dxa"/>
+          <w:bottom w:w="160" w:type="dxa"/>
+          <w:right w:w="200" w:type="dxa"/>
+        </w:tblCellMar>
+      </w:tblPr>
+      <w:tblGrid>
+        <w:gridCol w:w="9360"/>
+      </w:tblGrid>
+      <w:tr>
+        <w:trPr/>
+        <w:tc>
+          <w:tcPr>
+            <w:tcW w:w="9360" w:type="dxa"/>
+            <w:tcBorders>
+              <w:top w:val="single" w:sz="8" w:space="0" w:color="2E75B6"/>
+              <w:left w:val="single" w:sz="24" w:space="0" w:color="2E75B6"/>
+              <w:bottom w:val="single" w:sz="8" w:space="0" w:color="2E75B6"/>
+              <w:right w:val="single" w:sz="8" w:space="0" w:color="2E75B6"/>
+            </w:tcBorders>
+            <w:shd w:fill="DEEAF6" w:val="clear"/>
+          </w:tcPr>
+          <w:p>
+            <w:pPr>
+              <w:pStyle w:val="Normal"/>
+              <w:rPr/>
+            </w:pPr>
+            <w:r>
+              <w:rPr>
+                <w:i/>
+                <w:iCs/>
+              </w:rPr>
+              <w:t xml:space="preserve">Why this matters: in any dispute — payment, lease, maintenance, access — the audit log can show exactly who did what and when. No "he said, she said".</w:t>
+            </w:r>
+          </w:p>
+        </w:tc>
+      </w:tr>
+    </w:tbl>
+    <w:p>
+      <w:pPr>
+        <w:pStyle w:val="Heading2"/>
+        <w:spacing w:before="200" w:after="100"/>
+        <w:rPr/>
+      </w:pPr>
+      <w:r>
+        <w:rPr/>
+        <w:t xml:space="preserve">6. Late Fee — Implementation Detail</w:t>
+      </w:r>
+    </w:p>
+    <w:p>
+      <w:pPr>
+        <w:pStyle w:val="Normal"/>
+        <w:spacing w:before="0" w:after="120"/>
+        <w:rPr/>
+      </w:pPr>
+      <w:r>
+        <w:t xml:space="preserve">The original blueprint defined the late fee as 2% per full week overdue. We have now confirmed how this is implemented in the system:</w:t>
+      </w:r>
+    </w:p>
+    <w:p>
+      <w:pPr>
+        <w:pStyle w:val="ListParagraph"/>
+        <w:numPr>
+          <w:ilvl w:val="0"/>
+          <w:numId w:val="1"/>
+        </w:numPr>
+        <w:spacing w:before="0" w:after="60"/>
+        <w:rPr/>
+      </w:pPr>
+      <w:r>
+        <w:rPr>
+          <w:b/>
+          <w:bCs/>
+        </w:rPr>
+        <w:t xml:space="preserve">Derived, not stored. </w:t>
+      </w:r>
+      <w:r>
+        <w:rPr/>
+        <w:t xml:space="preserve">The late fee is calculated at the moment it is shown — it is never written to the database as a stored value.</w:t>
+      </w:r>
+    </w:p>
+    <w:p>
+      <w:pPr>
+        <w:pStyle w:val="ListParagraph"/>
+        <w:numPr>
+          <w:ilvl w:val="0"/>
+          <w:numId w:val="1"/>
+        </w:numPr>
+        <w:spacing w:before="0" w:after="60"/>
+        <w:rPr/>
+      </w:pPr>
+      <w:r>
+        <w:rPr>
+          <w:b/>
+          <w:bCs/>
+        </w:rPr>
+        <w:t xml:space="preserve">Always accurate. </w:t>
+      </w:r>
+      <w:r>
+        <w:rPr/>
+        <w:t xml:space="preserve">This means the fee is always correct: if you correct an overdue date, the fee recalculates instantly. There is no stale number to maintain.</w:t>
+      </w:r>
+    </w:p>
+    <w:p>
+      <w:pPr>
+        <w:pStyle w:val="Heading2"/>
+        <w:spacing w:before="200" w:after="100"/>
+        <w:rPr/>
+      </w:pPr>
+      <w:r>
+        <w:rPr/>
+        <w:t xml:space="preserve">7. Units Page</w:t>
+      </w:r>
+    </w:p>
+    <w:p>
+      <w:pPr>
+        <w:pStyle w:val="Normal"/>
+        <w:spacing w:before="0" w:after="120"/>
+        <w:rPr/>
+      </w:pPr>
+      <w:r>
+        <w:t xml:space="preserve">A dedicated Units page has been added for two roles:</w:t>
+      </w:r>
+    </w:p>
+    <w:p>
+      <w:pPr>
+        <w:pStyle w:val="ListParagraph"/>
+        <w:numPr>
+          <w:ilvl w:val="0"/>
+          <w:numId w:val="1"/>
+        </w:numPr>
+        <w:spacing w:before="0" w:after="60"/>
+        <w:rPr/>
+      </w:pPr>
+      <w:r>
+        <w:rPr>
+          <w:b/>
+          <w:bCs/>
+        </w:rPr>
+        <w:t xml:space="preserve">Admin Units page. </w:t>
+      </w:r>
+      <w:r>
+        <w:rPr/>
+        <w:t xml:space="preserve">Admin sees every unit across all 18 properties, with filters for state, property, and search.</w:t>
+      </w:r>
+    </w:p>
+    <w:p>
+      <w:pPr>
+        <w:pStyle w:val="ListParagraph"/>
+        <w:numPr>
+          <w:ilvl w:val="0"/>
+          <w:numId w:val="1"/>
+        </w:numPr>
+        <w:spacing w:before="0" w:after="60"/>
+        <w:rPr/>
+      </w:pPr>
+      <w:r>
+        <w:rPr>
+          <w:b/>
+          <w:bCs/>
+        </w:rPr>
+        <w:t xml:space="preserve">PM Units page. </w:t>
+      </w:r>
+      <w:r>
+        <w:rPr/>
+        <w:t xml:space="preserve">Property Manager sees every unit in their assigned property, with filters for state and search.</w:t>
+      </w:r>
+    </w:p>
+    <w:p>
+      <w:pPr>
+        <w:pStyle w:val="ListParagraph"/>
+        <w:numPr>
+          <w:ilvl w:val="0"/>
+          <w:numId w:val="1"/>
+        </w:numPr>
+        <w:spacing w:before="0" w:after="60"/>
+        <w:rPr/>
+      </w:pPr>
+      <w:r>
+        <w:rPr>
+          <w:b/>
+          <w:bCs/>
+        </w:rPr>
+        <w:t xml:space="preserve">Status summary. </w:t>
+      </w:r>
+      <w:r>
+        <w:rPr/>
+        <w:t xml:space="preserve">Both pages show counts by state (Available, Listed, Occupied, Maintenance, and for Admin, Retired) at the top, and a filterable table below.</w:t>
+      </w:r>
+    </w:p>
+    <w:p>
+      <w:pPr>
+        <w:pStyle w:val="Normal"/>
+        <w:spacing w:before="0" w:after="120"/>
+        <w:rPr/>
+      </w:pPr>
+      <w:r>
+        <w:rPr>
+          <w:i/>
+          <w:iCs/>
+        </w:rPr>
+        <w:t xml:space="preserve">End of Version 2 changes.</w:t>
       </w:r>
     </w:p>
     <w:sectPr>

</xml_diff>